<commit_message>
Rename project to Merge on Steroids
Namespaces, assemblies, projects, solution, UI strings and docs move from
MailOnSteroids to MergeOnSteroids. The mos CLI name and the .mos.json
program extension are unchanged — they still read as "Merge On Steroids".

Co-Authored-By: Claude Fable 5 <noreply@anthropic.com>
</commit_message>
<xml_diff>
--- a/rich-sample/fragments/carta-saldo.docx
+++ b/rich-sample/fragments/carta-saldo.docx
@@ -454,7 +454,7 @@
     <w:link w:val="Heading1Char"/>
     <w:uiPriority w:val="9"/>
     <w:qFormat/>
-    <w:rsid w:val="0074204A"/>
+    <w:rsid w:val="00D747B7"/>
     <w:pPr>
       <w:keepNext/>
       <w:keepLines/>
@@ -476,7 +476,7 @@
     <w:uiPriority w:val="9"/>
     <w:unhideWhenUsed/>
     <w:qFormat/>
-    <w:rsid w:val="0074204A"/>
+    <w:rsid w:val="00D747B7"/>
     <w:pPr>
       <w:keepNext/>
       <w:keepLines/>
@@ -499,7 +499,7 @@
     <w:semiHidden/>
     <w:unhideWhenUsed/>
     <w:qFormat/>
-    <w:rsid w:val="0074204A"/>
+    <w:rsid w:val="00D747B7"/>
     <w:pPr>
       <w:keepNext/>
       <w:keepLines/>
@@ -522,7 +522,7 @@
     <w:semiHidden/>
     <w:unhideWhenUsed/>
     <w:qFormat/>
-    <w:rsid w:val="0074204A"/>
+    <w:rsid w:val="00D747B7"/>
     <w:pPr>
       <w:keepNext/>
       <w:keepLines/>
@@ -545,7 +545,7 @@
     <w:semiHidden/>
     <w:unhideWhenUsed/>
     <w:qFormat/>
-    <w:rsid w:val="0074204A"/>
+    <w:rsid w:val="00D747B7"/>
     <w:pPr>
       <w:keepNext/>
       <w:keepLines/>
@@ -566,7 +566,7 @@
     <w:semiHidden/>
     <w:unhideWhenUsed/>
     <w:qFormat/>
-    <w:rsid w:val="0074204A"/>
+    <w:rsid w:val="00D747B7"/>
     <w:pPr>
       <w:keepNext/>
       <w:keepLines/>
@@ -589,7 +589,7 @@
     <w:semiHidden/>
     <w:unhideWhenUsed/>
     <w:qFormat/>
-    <w:rsid w:val="0074204A"/>
+    <w:rsid w:val="00D747B7"/>
     <w:pPr>
       <w:keepNext/>
       <w:keepLines/>
@@ -610,7 +610,7 @@
     <w:semiHidden/>
     <w:unhideWhenUsed/>
     <w:qFormat/>
-    <w:rsid w:val="0074204A"/>
+    <w:rsid w:val="00D747B7"/>
     <w:pPr>
       <w:keepNext/>
       <w:keepLines/>
@@ -633,7 +633,7 @@
     <w:semiHidden/>
     <w:unhideWhenUsed/>
     <w:qFormat/>
-    <w:rsid w:val="0074204A"/>
+    <w:rsid w:val="00D747B7"/>
     <w:pPr>
       <w:keepNext/>
       <w:keepLines/>
@@ -677,7 +677,7 @@
     <w:basedOn w:val="DefaultParagraphFont"/>
     <w:link w:val="Heading1"/>
     <w:uiPriority w:val="9"/>
-    <w:rsid w:val="0074204A"/>
+    <w:rsid w:val="00D747B7"/>
     <w:rPr>
       <w:rFonts w:asciiTheme="majorHAnsi" w:eastAsiaTheme="majorEastAsia" w:hAnsiTheme="majorHAnsi" w:cstheme="majorBidi"/>
       <w:color w:val="0F4761" w:themeColor="accent1" w:themeShade="BF"/>
@@ -690,7 +690,7 @@
     <w:basedOn w:val="DefaultParagraphFont"/>
     <w:link w:val="Heading2"/>
     <w:uiPriority w:val="9"/>
-    <w:rsid w:val="0074204A"/>
+    <w:rsid w:val="00D747B7"/>
     <w:rPr>
       <w:rFonts w:asciiTheme="majorHAnsi" w:eastAsiaTheme="majorEastAsia" w:hAnsiTheme="majorHAnsi" w:cstheme="majorBidi"/>
       <w:color w:val="0F4761" w:themeColor="accent1" w:themeShade="BF"/>
@@ -704,7 +704,7 @@
     <w:link w:val="Heading3"/>
     <w:uiPriority w:val="9"/>
     <w:semiHidden/>
-    <w:rsid w:val="0074204A"/>
+    <w:rsid w:val="00D747B7"/>
     <w:rPr>
       <w:rFonts w:eastAsiaTheme="majorEastAsia" w:cstheme="majorBidi"/>
       <w:color w:val="0F4761" w:themeColor="accent1" w:themeShade="BF"/>
@@ -718,7 +718,7 @@
     <w:link w:val="Heading4"/>
     <w:uiPriority w:val="9"/>
     <w:semiHidden/>
-    <w:rsid w:val="0074204A"/>
+    <w:rsid w:val="00D747B7"/>
     <w:rPr>
       <w:rFonts w:eastAsiaTheme="majorEastAsia" w:cstheme="majorBidi"/>
       <w:i/>
@@ -732,7 +732,7 @@
     <w:link w:val="Heading5"/>
     <w:uiPriority w:val="9"/>
     <w:semiHidden/>
-    <w:rsid w:val="0074204A"/>
+    <w:rsid w:val="00D747B7"/>
     <w:rPr>
       <w:rFonts w:eastAsiaTheme="majorEastAsia" w:cstheme="majorBidi"/>
       <w:color w:val="0F4761" w:themeColor="accent1" w:themeShade="BF"/>
@@ -744,7 +744,7 @@
     <w:link w:val="Heading6"/>
     <w:uiPriority w:val="9"/>
     <w:semiHidden/>
-    <w:rsid w:val="0074204A"/>
+    <w:rsid w:val="00D747B7"/>
     <w:rPr>
       <w:rFonts w:eastAsiaTheme="majorEastAsia" w:cstheme="majorBidi"/>
       <w:i/>
@@ -758,7 +758,7 @@
     <w:link w:val="Heading7"/>
     <w:uiPriority w:val="9"/>
     <w:semiHidden/>
-    <w:rsid w:val="0074204A"/>
+    <w:rsid w:val="00D747B7"/>
     <w:rPr>
       <w:rFonts w:eastAsiaTheme="majorEastAsia" w:cstheme="majorBidi"/>
       <w:color w:val="595959" w:themeColor="text1" w:themeTint="A6"/>
@@ -770,7 +770,7 @@
     <w:link w:val="Heading8"/>
     <w:uiPriority w:val="9"/>
     <w:semiHidden/>
-    <w:rsid w:val="0074204A"/>
+    <w:rsid w:val="00D747B7"/>
     <w:rPr>
       <w:rFonts w:eastAsiaTheme="majorEastAsia" w:cstheme="majorBidi"/>
       <w:i/>
@@ -784,7 +784,7 @@
     <w:link w:val="Heading9"/>
     <w:uiPriority w:val="9"/>
     <w:semiHidden/>
-    <w:rsid w:val="0074204A"/>
+    <w:rsid w:val="00D747B7"/>
     <w:rPr>
       <w:rFonts w:eastAsiaTheme="majorEastAsia" w:cstheme="majorBidi"/>
       <w:color w:val="272727" w:themeColor="text1" w:themeTint="D8"/>
@@ -797,7 +797,7 @@
     <w:link w:val="TitleChar"/>
     <w:uiPriority w:val="10"/>
     <w:qFormat/>
-    <w:rsid w:val="0074204A"/>
+    <w:rsid w:val="00D747B7"/>
     <w:pPr>
       <w:spacing w:after="80" w:line="240" w:lineRule="auto"/>
       <w:contextualSpacing/>
@@ -815,7 +815,7 @@
     <w:basedOn w:val="DefaultParagraphFont"/>
     <w:link w:val="Title"/>
     <w:uiPriority w:val="10"/>
-    <w:rsid w:val="0074204A"/>
+    <w:rsid w:val="00D747B7"/>
     <w:rPr>
       <w:rFonts w:asciiTheme="majorHAnsi" w:eastAsiaTheme="majorEastAsia" w:hAnsiTheme="majorHAnsi" w:cstheme="majorBidi"/>
       <w:spacing w:val="-10"/>
@@ -831,7 +831,7 @@
     <w:link w:val="SubtitleChar"/>
     <w:uiPriority w:val="11"/>
     <w:qFormat/>
-    <w:rsid w:val="0074204A"/>
+    <w:rsid w:val="00D747B7"/>
     <w:pPr>
       <w:numPr>
         <w:ilvl w:val="1"/>
@@ -850,7 +850,7 @@
     <w:basedOn w:val="DefaultParagraphFont"/>
     <w:link w:val="Subtitle"/>
     <w:uiPriority w:val="11"/>
-    <w:rsid w:val="0074204A"/>
+    <w:rsid w:val="00D747B7"/>
     <w:rPr>
       <w:rFonts w:eastAsiaTheme="majorEastAsia" w:cstheme="majorBidi"/>
       <w:color w:val="595959" w:themeColor="text1" w:themeTint="A6"/>
@@ -866,7 +866,7 @@
     <w:link w:val="QuoteChar"/>
     <w:uiPriority w:val="29"/>
     <w:qFormat/>
-    <w:rsid w:val="0074204A"/>
+    <w:rsid w:val="00D747B7"/>
     <w:pPr>
       <w:spacing w:before="160"/>
       <w:jc w:val="center"/>
@@ -882,7 +882,7 @@
     <w:basedOn w:val="DefaultParagraphFont"/>
     <w:link w:val="Quote"/>
     <w:uiPriority w:val="29"/>
-    <w:rsid w:val="0074204A"/>
+    <w:rsid w:val="00D747B7"/>
     <w:rPr>
       <w:i/>
       <w:iCs/>
@@ -894,7 +894,7 @@
     <w:basedOn w:val="Normal"/>
     <w:uiPriority w:val="34"/>
     <w:qFormat/>
-    <w:rsid w:val="0074204A"/>
+    <w:rsid w:val="00D747B7"/>
     <w:pPr>
       <w:ind w:left="720"/>
       <w:contextualSpacing/>
@@ -905,7 +905,7 @@
     <w:basedOn w:val="DefaultParagraphFont"/>
     <w:uiPriority w:val="21"/>
     <w:qFormat/>
-    <w:rsid w:val="0074204A"/>
+    <w:rsid w:val="00D747B7"/>
     <w:rPr>
       <w:i/>
       <w:iCs/>
@@ -919,7 +919,7 @@
     <w:link w:val="IntenseQuoteChar"/>
     <w:uiPriority w:val="30"/>
     <w:qFormat/>
-    <w:rsid w:val="0074204A"/>
+    <w:rsid w:val="00D747B7"/>
     <w:pPr>
       <w:pBdr>
         <w:top w:val="single" w:sz="4" w:space="10" w:color="0F4761" w:themeColor="accent1" w:themeShade="BF"/>
@@ -940,7 +940,7 @@
     <w:basedOn w:val="DefaultParagraphFont"/>
     <w:link w:val="IntenseQuote"/>
     <w:uiPriority w:val="30"/>
-    <w:rsid w:val="0074204A"/>
+    <w:rsid w:val="00D747B7"/>
     <w:rPr>
       <w:i/>
       <w:iCs/>
@@ -952,7 +952,7 @@
     <w:basedOn w:val="DefaultParagraphFont"/>
     <w:uiPriority w:val="32"/>
     <w:qFormat/>
-    <w:rsid w:val="0074204A"/>
+    <w:rsid w:val="00D747B7"/>
     <w:rPr>
       <w:b/>
       <w:bCs/>

</xml_diff>